<commit_message>
Add decomposed servo tuning parameters
</commit_message>
<xml_diff>
--- a/docs/servo_config_protocol.docx
+++ b/docs/servo_config_protocol.docx
@@ -13,7 +13,7 @@
     <w:p>
       <w:pPr/>
       <w:r>
-        <w:t xml:space="preserve">版本：v0.1</w:t>
+        <w:t xml:space="preserve">版本：v0.2</w:t>
       </w:r>
     </w:p>
     <w:p>
@@ -1445,7 +1445,7 @@
           <w:p>
             <w:pPr/>
             <w:r>
-              <w:t xml:space="preserve">Payload 字节数，最大 96</w:t>
+              <w:t xml:space="preserve">Payload 字节数，最大 120</w:t>
             </w:r>
           </w:p>
         </w:tc>
@@ -2780,7 +2780,7 @@
           <w:p>
             <w:pPr/>
             <w:r>
-              <w:t xml:space="preserve">当前 1</w:t>
+              <w:t xml:space="preserve">当前 2</w:t>
             </w:r>
           </w:p>
         </w:tc>
@@ -3931,6 +3931,1294 @@
             <w:pPr/>
             <w:r>
               <w:t xml:space="preserve">失信号时间</w:t>
+            </w:r>
+          </w:p>
+        </w:tc>
+      </w:tr>
+      <w:tr>
+        <w:tc>
+          <w:tcPr>
+            <w:tcW w:w="2400" w:type="dxa"/>
+          </w:tcPr>
+          <w:p>
+            <w:pPr/>
+            <w:r>
+              <w:t xml:space="preserve">model_id</w:t>
+            </w:r>
+          </w:p>
+        </w:tc>
+        <w:tc>
+          <w:tcPr>
+            <w:tcW w:w="2400" w:type="dxa"/>
+          </w:tcPr>
+          <w:p>
+            <w:pPr/>
+            <w:r>
+              <w:t xml:space="preserve">uint16_t</w:t>
+            </w:r>
+          </w:p>
+        </w:tc>
+        <w:tc>
+          <w:tcPr>
+            <w:tcW w:w="2400" w:type="dxa"/>
+          </w:tcPr>
+          <w:p>
+            <w:pPr/>
+            <w:r>
+              <w:t xml:space="preserve">型号选择</w:t>
+            </w:r>
+          </w:p>
+        </w:tc>
+        <w:tc>
+          <w:tcPr>
+            <w:tcW w:w="2400" w:type="dxa"/>
+          </w:tcPr>
+          <w:p>
+            <w:pPr/>
+            <w:r>
+              <w:t xml:space="preserve">区分塑胶齿、金属齿或客户型号</w:t>
+            </w:r>
+          </w:p>
+        </w:tc>
+      </w:tr>
+      <w:tr>
+        <w:tc>
+          <w:tcPr>
+            <w:tcW w:w="2400" w:type="dxa"/>
+          </w:tcPr>
+          <w:p>
+            <w:pPr/>
+            <w:r>
+              <w:t xml:space="preserve">profile_id</w:t>
+            </w:r>
+          </w:p>
+        </w:tc>
+        <w:tc>
+          <w:tcPr>
+            <w:tcW w:w="2400" w:type="dxa"/>
+          </w:tcPr>
+          <w:p>
+            <w:pPr/>
+            <w:r>
+              <w:t xml:space="preserve">uint16_t</w:t>
+            </w:r>
+          </w:p>
+        </w:tc>
+        <w:tc>
+          <w:tcPr>
+            <w:tcW w:w="2400" w:type="dxa"/>
+          </w:tcPr>
+          <w:p>
+            <w:pPr/>
+            <w:r>
+              <w:t xml:space="preserve">参数模板</w:t>
+            </w:r>
+          </w:p>
+        </w:tc>
+        <w:tc>
+          <w:tcPr>
+            <w:tcW w:w="2400" w:type="dxa"/>
+          </w:tcPr>
+          <w:p>
+            <w:pPr/>
+            <w:r>
+              <w:t xml:space="preserve">区分快速、标准、安静、高保持力等模板</w:t>
+            </w:r>
+          </w:p>
+        </w:tc>
+      </w:tr>
+      <w:tr>
+        <w:tc>
+          <w:tcPr>
+            <w:tcW w:w="2400" w:type="dxa"/>
+          </w:tcPr>
+          <w:p>
+            <w:pPr/>
+            <w:r>
+              <w:t xml:space="preserve">startup_delay_ms</w:t>
+            </w:r>
+          </w:p>
+        </w:tc>
+        <w:tc>
+          <w:tcPr>
+            <w:tcW w:w="2400" w:type="dxa"/>
+          </w:tcPr>
+          <w:p>
+            <w:pPr/>
+            <w:r>
+              <w:t xml:space="preserve">uint16_t</w:t>
+            </w:r>
+          </w:p>
+        </w:tc>
+        <w:tc>
+          <w:tcPr>
+            <w:tcW w:w="2400" w:type="dxa"/>
+          </w:tcPr>
+          <w:p>
+            <w:pPr/>
+            <w:r>
+              <w:t xml:space="preserve">上电防乱跑</w:t>
+            </w:r>
+          </w:p>
+        </w:tc>
+        <w:tc>
+          <w:tcPr>
+            <w:tcW w:w="2400" w:type="dxa"/>
+          </w:tcPr>
+          <w:p>
+            <w:pPr/>
+            <w:r>
+              <w:t xml:space="preserve">上电后先等待电源、PWM、ADC 稳定</w:t>
+            </w:r>
+          </w:p>
+        </w:tc>
+      </w:tr>
+      <w:tr>
+        <w:tc>
+          <w:tcPr>
+            <w:tcW w:w="2400" w:type="dxa"/>
+          </w:tcPr>
+          <w:p>
+            <w:pPr/>
+            <w:r>
+              <w:t xml:space="preserve">startup_input_stable_count</w:t>
+            </w:r>
+          </w:p>
+        </w:tc>
+        <w:tc>
+          <w:tcPr>
+            <w:tcW w:w="2400" w:type="dxa"/>
+          </w:tcPr>
+          <w:p>
+            <w:pPr/>
+            <w:r>
+              <w:t xml:space="preserve">uint16_t</w:t>
+            </w:r>
+          </w:p>
+        </w:tc>
+        <w:tc>
+          <w:tcPr>
+            <w:tcW w:w="2400" w:type="dxa"/>
+          </w:tcPr>
+          <w:p>
+            <w:pPr/>
+            <w:r>
+              <w:t xml:space="preserve">上电防乱跑</w:t>
+            </w:r>
+          </w:p>
+        </w:tc>
+        <w:tc>
+          <w:tcPr>
+            <w:tcW w:w="2400" w:type="dxa"/>
+          </w:tcPr>
+          <w:p>
+            <w:pPr/>
+            <w:r>
+              <w:t xml:space="preserve">连续多少个稳定 PWM 样本后允许闭环</w:t>
+            </w:r>
+          </w:p>
+        </w:tc>
+      </w:tr>
+      <w:tr>
+        <w:tc>
+          <w:tcPr>
+            <w:tcW w:w="2400" w:type="dxa"/>
+          </w:tcPr>
+          <w:p>
+            <w:pPr/>
+            <w:r>
+              <w:t xml:space="preserve">startup_input_stable_us</w:t>
+            </w:r>
+          </w:p>
+        </w:tc>
+        <w:tc>
+          <w:tcPr>
+            <w:tcW w:w="2400" w:type="dxa"/>
+          </w:tcPr>
+          <w:p>
+            <w:pPr/>
+            <w:r>
+              <w:t xml:space="preserve">uint16_t</w:t>
+            </w:r>
+          </w:p>
+        </w:tc>
+        <w:tc>
+          <w:tcPr>
+            <w:tcW w:w="2400" w:type="dxa"/>
+          </w:tcPr>
+          <w:p>
+            <w:pPr/>
+            <w:r>
+              <w:t xml:space="preserve">上电防乱跑</w:t>
+            </w:r>
+          </w:p>
+        </w:tc>
+        <w:tc>
+          <w:tcPr>
+            <w:tcW w:w="2400" w:type="dxa"/>
+          </w:tcPr>
+          <w:p>
+            <w:pPr/>
+            <w:r>
+              <w:t xml:space="preserve">PWM 稳定判定允许的 us 变化</w:t>
+            </w:r>
+          </w:p>
+        </w:tc>
+      </w:tr>
+      <w:tr>
+        <w:tc>
+          <w:tcPr>
+            <w:tcW w:w="2400" w:type="dxa"/>
+          </w:tcPr>
+          <w:p>
+            <w:pPr/>
+            <w:r>
+              <w:t xml:space="preserve">startup_adc_stable_count</w:t>
+            </w:r>
+          </w:p>
+        </w:tc>
+        <w:tc>
+          <w:tcPr>
+            <w:tcW w:w="2400" w:type="dxa"/>
+          </w:tcPr>
+          <w:p>
+            <w:pPr/>
+            <w:r>
+              <w:t xml:space="preserve">uint16_t</w:t>
+            </w:r>
+          </w:p>
+        </w:tc>
+        <w:tc>
+          <w:tcPr>
+            <w:tcW w:w="2400" w:type="dxa"/>
+          </w:tcPr>
+          <w:p>
+            <w:pPr/>
+            <w:r>
+              <w:t xml:space="preserve">上电防乱跑</w:t>
+            </w:r>
+          </w:p>
+        </w:tc>
+        <w:tc>
+          <w:tcPr>
+            <w:tcW w:w="2400" w:type="dxa"/>
+          </w:tcPr>
+          <w:p>
+            <w:pPr/>
+            <w:r>
+              <w:t xml:space="preserve">连续多少个稳定 ADC 样本后允许闭环</w:t>
+            </w:r>
+          </w:p>
+        </w:tc>
+      </w:tr>
+      <w:tr>
+        <w:tc>
+          <w:tcPr>
+            <w:tcW w:w="2400" w:type="dxa"/>
+          </w:tcPr>
+          <w:p>
+            <w:pPr/>
+            <w:r>
+              <w:t xml:space="preserve">startup_adc_stable_band_count</w:t>
+            </w:r>
+          </w:p>
+        </w:tc>
+        <w:tc>
+          <w:tcPr>
+            <w:tcW w:w="2400" w:type="dxa"/>
+          </w:tcPr>
+          <w:p>
+            <w:pPr/>
+            <w:r>
+              <w:t xml:space="preserve">uint16_t</w:t>
+            </w:r>
+          </w:p>
+        </w:tc>
+        <w:tc>
+          <w:tcPr>
+            <w:tcW w:w="2400" w:type="dxa"/>
+          </w:tcPr>
+          <w:p>
+            <w:pPr/>
+            <w:r>
+              <w:t xml:space="preserve">上电防乱跑</w:t>
+            </w:r>
+          </w:p>
+        </w:tc>
+        <w:tc>
+          <w:tcPr>
+            <w:tcW w:w="2400" w:type="dxa"/>
+          </w:tcPr>
+          <w:p>
+            <w:pPr/>
+            <w:r>
+              <w:t xml:space="preserve">ADC 稳定判定允许的 count 变化</w:t>
+            </w:r>
+          </w:p>
+        </w:tc>
+      </w:tr>
+      <w:tr>
+        <w:tc>
+          <w:tcPr>
+            <w:tcW w:w="2400" w:type="dxa"/>
+          </w:tcPr>
+          <w:p>
+            <w:pPr/>
+            <w:r>
+              <w:t xml:space="preserve">startup_step_count</w:t>
+            </w:r>
+          </w:p>
+        </w:tc>
+        <w:tc>
+          <w:tcPr>
+            <w:tcW w:w="2400" w:type="dxa"/>
+          </w:tcPr>
+          <w:p>
+            <w:pPr/>
+            <w:r>
+              <w:t xml:space="preserve">uint16_t</w:t>
+            </w:r>
+          </w:p>
+        </w:tc>
+        <w:tc>
+          <w:tcPr>
+            <w:tcW w:w="2400" w:type="dxa"/>
+          </w:tcPr>
+          <w:p>
+            <w:pPr/>
+            <w:r>
+              <w:t xml:space="preserve">上电软启动</w:t>
+            </w:r>
+          </w:p>
+        </w:tc>
+        <w:tc>
+          <w:tcPr>
+            <w:tcW w:w="2400" w:type="dxa"/>
+          </w:tcPr>
+          <w:p>
+            <w:pPr/>
+            <w:r>
+              <w:t xml:space="preserve">第一次追目标时的目标 ADC 步进</w:t>
+            </w:r>
+          </w:p>
+        </w:tc>
+      </w:tr>
+      <w:tr>
+        <w:tc>
+          <w:tcPr>
+            <w:tcW w:w="2400" w:type="dxa"/>
+          </w:tcPr>
+          <w:p>
+            <w:pPr/>
+            <w:r>
+              <w:t xml:space="preserve">adc_sample_count</w:t>
+            </w:r>
+          </w:p>
+        </w:tc>
+        <w:tc>
+          <w:tcPr>
+            <w:tcW w:w="2400" w:type="dxa"/>
+          </w:tcPr>
+          <w:p>
+            <w:pPr/>
+            <w:r>
+              <w:t xml:space="preserve">uint16_t</w:t>
+            </w:r>
+          </w:p>
+        </w:tc>
+        <w:tc>
+          <w:tcPr>
+            <w:tcW w:w="2400" w:type="dxa"/>
+          </w:tcPr>
+          <w:p>
+            <w:pPr/>
+            <w:r>
+              <w:t xml:space="preserve">ADC 抗干扰</w:t>
+            </w:r>
+          </w:p>
+        </w:tc>
+        <w:tc>
+          <w:tcPr>
+            <w:tcW w:w="2400" w:type="dxa"/>
+          </w:tcPr>
+          <w:p>
+            <w:pPr/>
+            <w:r>
+              <w:t xml:space="preserve">每次反馈读取的平均采样次数</w:t>
+            </w:r>
+          </w:p>
+        </w:tc>
+      </w:tr>
+      <w:tr>
+        <w:tc>
+          <w:tcPr>
+            <w:tcW w:w="2400" w:type="dxa"/>
+          </w:tcPr>
+          <w:p>
+            <w:pPr/>
+            <w:r>
+              <w:t xml:space="preserve">adc_filter_shift</w:t>
+            </w:r>
+          </w:p>
+        </w:tc>
+        <w:tc>
+          <w:tcPr>
+            <w:tcW w:w="2400" w:type="dxa"/>
+          </w:tcPr>
+          <w:p>
+            <w:pPr/>
+            <w:r>
+              <w:t xml:space="preserve">uint16_t</w:t>
+            </w:r>
+          </w:p>
+        </w:tc>
+        <w:tc>
+          <w:tcPr>
+            <w:tcW w:w="2400" w:type="dxa"/>
+          </w:tcPr>
+          <w:p>
+            <w:pPr/>
+            <w:r>
+              <w:t xml:space="preserve">ADC 抗干扰</w:t>
+            </w:r>
+          </w:p>
+        </w:tc>
+        <w:tc>
+          <w:tcPr>
+            <w:tcW w:w="2400" w:type="dxa"/>
+          </w:tcPr>
+          <w:p>
+            <w:pPr/>
+            <w:r>
+              <w:t xml:space="preserve">IIR 滤波强度，越大越稳但越慢</w:t>
+            </w:r>
+          </w:p>
+        </w:tc>
+      </w:tr>
+      <w:tr>
+        <w:tc>
+          <w:tcPr>
+            <w:tcW w:w="2400" w:type="dxa"/>
+          </w:tcPr>
+          <w:p>
+            <w:pPr/>
+            <w:r>
+              <w:t xml:space="preserve">adc_jump_limit_count</w:t>
+            </w:r>
+          </w:p>
+        </w:tc>
+        <w:tc>
+          <w:tcPr>
+            <w:tcW w:w="2400" w:type="dxa"/>
+          </w:tcPr>
+          <w:p>
+            <w:pPr/>
+            <w:r>
+              <w:t xml:space="preserve">uint16_t</w:t>
+            </w:r>
+          </w:p>
+        </w:tc>
+        <w:tc>
+          <w:tcPr>
+            <w:tcW w:w="2400" w:type="dxa"/>
+          </w:tcPr>
+          <w:p>
+            <w:pPr/>
+            <w:r>
+              <w:t xml:space="preserve">ADC 抗干扰</w:t>
+            </w:r>
+          </w:p>
+        </w:tc>
+        <w:tc>
+          <w:tcPr>
+            <w:tcW w:w="2400" w:type="dxa"/>
+          </w:tcPr>
+          <w:p>
+            <w:pPr/>
+            <w:r>
+              <w:t xml:space="preserve">单次滤波前允许的最大 ADC 跳变，0 为关闭</w:t>
+            </w:r>
+          </w:p>
+        </w:tc>
+      </w:tr>
+      <w:tr>
+        <w:tc>
+          <w:tcPr>
+            <w:tcW w:w="2400" w:type="dxa"/>
+          </w:tcPr>
+          <w:p>
+            <w:pPr/>
+            <w:r>
+              <w:t xml:space="preserve">adc_noise_band_count</w:t>
+            </w:r>
+          </w:p>
+        </w:tc>
+        <w:tc>
+          <w:tcPr>
+            <w:tcW w:w="2400" w:type="dxa"/>
+          </w:tcPr>
+          <w:p>
+            <w:pPr/>
+            <w:r>
+              <w:t xml:space="preserve">uint16_t</w:t>
+            </w:r>
+          </w:p>
+        </w:tc>
+        <w:tc>
+          <w:tcPr>
+            <w:tcW w:w="2400" w:type="dxa"/>
+          </w:tcPr>
+          <w:p>
+            <w:pPr/>
+            <w:r>
+              <w:t xml:space="preserve">ADC 抗干扰</w:t>
+            </w:r>
+          </w:p>
+        </w:tc>
+        <w:tc>
+          <w:tcPr>
+            <w:tcW w:w="2400" w:type="dxa"/>
+          </w:tcPr>
+          <w:p>
+            <w:pPr/>
+            <w:r>
+              <w:t xml:space="preserve">噪声评估保留项，用于调试显示和后续算法</w:t>
+            </w:r>
+          </w:p>
+        </w:tc>
+      </w:tr>
+      <w:tr>
+        <w:tc>
+          <w:tcPr>
+            <w:tcW w:w="2400" w:type="dxa"/>
+          </w:tcPr>
+          <w:p>
+            <w:pPr/>
+            <w:r>
+              <w:t xml:space="preserve">hold_mode</w:t>
+            </w:r>
+          </w:p>
+        </w:tc>
+        <w:tc>
+          <w:tcPr>
+            <w:tcW w:w="2400" w:type="dxa"/>
+          </w:tcPr>
+          <w:p>
+            <w:pPr/>
+            <w:r>
+              <w:t xml:space="preserve">uint16_t</w:t>
+            </w:r>
+          </w:p>
+        </w:tc>
+        <w:tc>
+          <w:tcPr>
+            <w:tcW w:w="2400" w:type="dxa"/>
+          </w:tcPr>
+          <w:p>
+            <w:pPr/>
+            <w:r>
+              <w:t xml:space="preserve">到位保持</w:t>
+            </w:r>
+          </w:p>
+        </w:tc>
+        <w:tc>
+          <w:tcPr>
+            <w:tcW w:w="2400" w:type="dxa"/>
+          </w:tcPr>
+          <w:p>
+            <w:pPr/>
+            <w:r>
+              <w:t xml:space="preserve">0 滑行，1 持续刹车，2 短刹车后滑行</w:t>
+            </w:r>
+          </w:p>
+        </w:tc>
+      </w:tr>
+      <w:tr>
+        <w:tc>
+          <w:tcPr>
+            <w:tcW w:w="2400" w:type="dxa"/>
+          </w:tcPr>
+          <w:p>
+            <w:pPr/>
+            <w:r>
+              <w:t xml:space="preserve">hold_exit_band_count</w:t>
+            </w:r>
+          </w:p>
+        </w:tc>
+        <w:tc>
+          <w:tcPr>
+            <w:tcW w:w="2400" w:type="dxa"/>
+          </w:tcPr>
+          <w:p>
+            <w:pPr/>
+            <w:r>
+              <w:t xml:space="preserve">uint16_t</w:t>
+            </w:r>
+          </w:p>
+        </w:tc>
+        <w:tc>
+          <w:tcPr>
+            <w:tcW w:w="2400" w:type="dxa"/>
+          </w:tcPr>
+          <w:p>
+            <w:pPr/>
+            <w:r>
+              <w:t xml:space="preserve">到位保持</w:t>
+            </w:r>
+          </w:p>
+        </w:tc>
+        <w:tc>
+          <w:tcPr>
+            <w:tcW w:w="2400" w:type="dxa"/>
+          </w:tcPr>
+          <w:p>
+            <w:pPr/>
+            <w:r>
+              <w:t xml:space="preserve">HOLD 状态退出阈值，形成滞回</w:t>
+            </w:r>
+          </w:p>
+        </w:tc>
+      </w:tr>
+      <w:tr>
+        <w:tc>
+          <w:tcPr>
+            <w:tcW w:w="2400" w:type="dxa"/>
+          </w:tcPr>
+          <w:p>
+            <w:pPr/>
+            <w:r>
+              <w:t xml:space="preserve">hold_brake_time_ms</w:t>
+            </w:r>
+          </w:p>
+        </w:tc>
+        <w:tc>
+          <w:tcPr>
+            <w:tcW w:w="2400" w:type="dxa"/>
+          </w:tcPr>
+          <w:p>
+            <w:pPr/>
+            <w:r>
+              <w:t xml:space="preserve">uint16_t</w:t>
+            </w:r>
+          </w:p>
+        </w:tc>
+        <w:tc>
+          <w:tcPr>
+            <w:tcW w:w="2400" w:type="dxa"/>
+          </w:tcPr>
+          <w:p>
+            <w:pPr/>
+            <w:r>
+              <w:t xml:space="preserve">到位保持</w:t>
+            </w:r>
+          </w:p>
+        </w:tc>
+        <w:tc>
+          <w:tcPr>
+            <w:tcW w:w="2400" w:type="dxa"/>
+          </w:tcPr>
+          <w:p>
+            <w:pPr/>
+            <w:r>
+              <w:t xml:space="preserve">短刹车保持时间</w:t>
+            </w:r>
+          </w:p>
+        </w:tc>
+      </w:tr>
+      <w:tr>
+        <w:tc>
+          <w:tcPr>
+            <w:tcW w:w="2400" w:type="dxa"/>
+          </w:tcPr>
+          <w:p>
+            <w:pPr/>
+            <w:r>
+              <w:t xml:space="preserve">hold_settle_ms</w:t>
+            </w:r>
+          </w:p>
+        </w:tc>
+        <w:tc>
+          <w:tcPr>
+            <w:tcW w:w="2400" w:type="dxa"/>
+          </w:tcPr>
+          <w:p>
+            <w:pPr/>
+            <w:r>
+              <w:t xml:space="preserve">uint16_t</w:t>
+            </w:r>
+          </w:p>
+        </w:tc>
+        <w:tc>
+          <w:tcPr>
+            <w:tcW w:w="2400" w:type="dxa"/>
+          </w:tcPr>
+          <w:p>
+            <w:pPr/>
+            <w:r>
+              <w:t xml:space="preserve">到位保持</w:t>
+            </w:r>
+          </w:p>
+        </w:tc>
+        <w:tc>
+          <w:tcPr>
+            <w:tcW w:w="2400" w:type="dxa"/>
+          </w:tcPr>
+          <w:p>
+            <w:pPr/>
+            <w:r>
+              <w:t xml:space="preserve">到位稳定时间保留项，用于后续判定</w:t>
+            </w:r>
+          </w:p>
+        </w:tc>
+      </w:tr>
+      <w:tr>
+        <w:tc>
+          <w:tcPr>
+            <w:tcW w:w="2400" w:type="dxa"/>
+          </w:tcPr>
+          <w:p>
+            <w:pPr/>
+            <w:r>
+              <w:t xml:space="preserve">close_error_count</w:t>
+            </w:r>
+          </w:p>
+        </w:tc>
+        <w:tc>
+          <w:tcPr>
+            <w:tcW w:w="2400" w:type="dxa"/>
+          </w:tcPr>
+          <w:p>
+            <w:pPr/>
+            <w:r>
+              <w:t xml:space="preserve">uint16_t</w:t>
+            </w:r>
+          </w:p>
+        </w:tc>
+        <w:tc>
+          <w:tcPr>
+            <w:tcW w:w="2400" w:type="dxa"/>
+          </w:tcPr>
+          <w:p>
+            <w:pPr/>
+            <w:r>
+              <w:t xml:space="preserve">近目标控制</w:t>
+            </w:r>
+          </w:p>
+        </w:tc>
+        <w:tc>
+          <w:tcPr>
+            <w:tcW w:w="2400" w:type="dxa"/>
+          </w:tcPr>
+          <w:p>
+            <w:pPr/>
+            <w:r>
+              <w:t xml:space="preserve">小误差区上限</w:t>
+            </w:r>
+          </w:p>
+        </w:tc>
+      </w:tr>
+      <w:tr>
+        <w:tc>
+          <w:tcPr>
+            <w:tcW w:w="2400" w:type="dxa"/>
+          </w:tcPr>
+          <w:p>
+            <w:pPr/>
+            <w:r>
+              <w:t xml:space="preserve">close_stretcher_q8</w:t>
+            </w:r>
+          </w:p>
+        </w:tc>
+        <w:tc>
+          <w:tcPr>
+            <w:tcW w:w="2400" w:type="dxa"/>
+          </w:tcPr>
+          <w:p>
+            <w:pPr/>
+            <w:r>
+              <w:t xml:space="preserve">uint16_t</w:t>
+            </w:r>
+          </w:p>
+        </w:tc>
+        <w:tc>
+          <w:tcPr>
+            <w:tcW w:w="2400" w:type="dxa"/>
+          </w:tcPr>
+          <w:p>
+            <w:pPr/>
+            <w:r>
+              <w:t xml:space="preserve">近目标控制</w:t>
+            </w:r>
+          </w:p>
+        </w:tc>
+        <w:tc>
+          <w:tcPr>
+            <w:tcW w:w="2400" w:type="dxa"/>
+          </w:tcPr>
+          <w:p>
+            <w:pPr/>
+            <w:r>
+              <w:t xml:space="preserve">小误差区增益</w:t>
+            </w:r>
+          </w:p>
+        </w:tc>
+      </w:tr>
+      <w:tr>
+        <w:tc>
+          <w:tcPr>
+            <w:tcW w:w="2400" w:type="dxa"/>
+          </w:tcPr>
+          <w:p>
+            <w:pPr/>
+            <w:r>
+              <w:t xml:space="preserve">close_boost_duty</w:t>
+            </w:r>
+          </w:p>
+        </w:tc>
+        <w:tc>
+          <w:tcPr>
+            <w:tcW w:w="2400" w:type="dxa"/>
+          </w:tcPr>
+          <w:p>
+            <w:pPr/>
+            <w:r>
+              <w:t xml:space="preserve">uint16_t</w:t>
+            </w:r>
+          </w:p>
+        </w:tc>
+        <w:tc>
+          <w:tcPr>
+            <w:tcW w:w="2400" w:type="dxa"/>
+          </w:tcPr>
+          <w:p>
+            <w:pPr/>
+            <w:r>
+              <w:t xml:space="preserve">近目标控制</w:t>
+            </w:r>
+          </w:p>
+        </w:tc>
+        <w:tc>
+          <w:tcPr>
+            <w:tcW w:w="2400" w:type="dxa"/>
+          </w:tcPr>
+          <w:p>
+            <w:pPr/>
+            <w:r>
+              <w:t xml:space="preserve">小误差区起动补偿</w:t>
+            </w:r>
+          </w:p>
+        </w:tc>
+      </w:tr>
+      <w:tr>
+        <w:tc>
+          <w:tcPr>
+            <w:tcW w:w="2400" w:type="dxa"/>
+          </w:tcPr>
+          <w:p>
+            <w:pPr/>
+            <w:r>
+              <w:t xml:space="preserve">approach_error_count</w:t>
+            </w:r>
+          </w:p>
+        </w:tc>
+        <w:tc>
+          <w:tcPr>
+            <w:tcW w:w="2400" w:type="dxa"/>
+          </w:tcPr>
+          <w:p>
+            <w:pPr/>
+            <w:r>
+              <w:t xml:space="preserve">uint16_t</w:t>
+            </w:r>
+          </w:p>
+        </w:tc>
+        <w:tc>
+          <w:tcPr>
+            <w:tcW w:w="2400" w:type="dxa"/>
+          </w:tcPr>
+          <w:p>
+            <w:pPr/>
+            <w:r>
+              <w:t xml:space="preserve">末端控制</w:t>
+            </w:r>
+          </w:p>
+        </w:tc>
+        <w:tc>
+          <w:tcPr>
+            <w:tcW w:w="2400" w:type="dxa"/>
+          </w:tcPr>
+          <w:p>
+            <w:pPr/>
+            <w:r>
+              <w:t xml:space="preserve">接近目标区上限</w:t>
+            </w:r>
+          </w:p>
+        </w:tc>
+      </w:tr>
+      <w:tr>
+        <w:tc>
+          <w:tcPr>
+            <w:tcW w:w="2400" w:type="dxa"/>
+          </w:tcPr>
+          <w:p>
+            <w:pPr/>
+            <w:r>
+              <w:t xml:space="preserve">approach_stretcher_q8</w:t>
+            </w:r>
+          </w:p>
+        </w:tc>
+        <w:tc>
+          <w:tcPr>
+            <w:tcW w:w="2400" w:type="dxa"/>
+          </w:tcPr>
+          <w:p>
+            <w:pPr/>
+            <w:r>
+              <w:t xml:space="preserve">uint16_t</w:t>
+            </w:r>
+          </w:p>
+        </w:tc>
+        <w:tc>
+          <w:tcPr>
+            <w:tcW w:w="2400" w:type="dxa"/>
+          </w:tcPr>
+          <w:p>
+            <w:pPr/>
+            <w:r>
+              <w:t xml:space="preserve">末端控制</w:t>
+            </w:r>
+          </w:p>
+        </w:tc>
+        <w:tc>
+          <w:tcPr>
+            <w:tcW w:w="2400" w:type="dxa"/>
+          </w:tcPr>
+          <w:p>
+            <w:pPr/>
+            <w:r>
+              <w:t xml:space="preserve">接近目标区增益</w:t>
+            </w:r>
+          </w:p>
+        </w:tc>
+      </w:tr>
+      <w:tr>
+        <w:tc>
+          <w:tcPr>
+            <w:tcW w:w="2400" w:type="dxa"/>
+          </w:tcPr>
+          <w:p>
+            <w:pPr/>
+            <w:r>
+              <w:t xml:space="preserve">approach_boost_duty</w:t>
+            </w:r>
+          </w:p>
+        </w:tc>
+        <w:tc>
+          <w:tcPr>
+            <w:tcW w:w="2400" w:type="dxa"/>
+          </w:tcPr>
+          <w:p>
+            <w:pPr/>
+            <w:r>
+              <w:t xml:space="preserve">uint16_t</w:t>
+            </w:r>
+          </w:p>
+        </w:tc>
+        <w:tc>
+          <w:tcPr>
+            <w:tcW w:w="2400" w:type="dxa"/>
+          </w:tcPr>
+          <w:p>
+            <w:pPr/>
+            <w:r>
+              <w:t xml:space="preserve">末端控制</w:t>
+            </w:r>
+          </w:p>
+        </w:tc>
+        <w:tc>
+          <w:tcPr>
+            <w:tcW w:w="2400" w:type="dxa"/>
+          </w:tcPr>
+          <w:p>
+            <w:pPr/>
+            <w:r>
+              <w:t xml:space="preserve">接近目标区起动补偿</w:t>
+            </w:r>
+          </w:p>
+        </w:tc>
+      </w:tr>
+      <w:tr>
+        <w:tc>
+          <w:tcPr>
+            <w:tcW w:w="2400" w:type="dxa"/>
+          </w:tcPr>
+          <w:p>
+            <w:pPr/>
+            <w:r>
+              <w:t xml:space="preserve">reverse_pause_ms</w:t>
+            </w:r>
+          </w:p>
+        </w:tc>
+        <w:tc>
+          <w:tcPr>
+            <w:tcW w:w="2400" w:type="dxa"/>
+          </w:tcPr>
+          <w:p>
+            <w:pPr/>
+            <w:r>
+              <w:t xml:space="preserve">uint16_t</w:t>
+            </w:r>
+          </w:p>
+        </w:tc>
+        <w:tc>
+          <w:tcPr>
+            <w:tcW w:w="2400" w:type="dxa"/>
+          </w:tcPr>
+          <w:p>
+            <w:pPr/>
+            <w:r>
+              <w:t xml:space="preserve">反向保护</w:t>
+            </w:r>
+          </w:p>
+        </w:tc>
+        <w:tc>
+          <w:tcPr>
+            <w:tcW w:w="2400" w:type="dxa"/>
+          </w:tcPr>
+          <w:p>
+            <w:pPr/>
+            <w:r>
+              <w:t xml:space="preserve">正反转切换前暂停时间</w:t>
+            </w:r>
+          </w:p>
+        </w:tc>
+      </w:tr>
+      <w:tr>
+        <w:tc>
+          <w:tcPr>
+            <w:tcW w:w="2400" w:type="dxa"/>
+          </w:tcPr>
+          <w:p>
+            <w:pPr/>
+            <w:r>
+              <w:t xml:space="preserve">reverse_brake_ms</w:t>
+            </w:r>
+          </w:p>
+        </w:tc>
+        <w:tc>
+          <w:tcPr>
+            <w:tcW w:w="2400" w:type="dxa"/>
+          </w:tcPr>
+          <w:p>
+            <w:pPr/>
+            <w:r>
+              <w:t xml:space="preserve">uint16_t</w:t>
+            </w:r>
+          </w:p>
+        </w:tc>
+        <w:tc>
+          <w:tcPr>
+            <w:tcW w:w="2400" w:type="dxa"/>
+          </w:tcPr>
+          <w:p>
+            <w:pPr/>
+            <w:r>
+              <w:t xml:space="preserve">反向保护</w:t>
+            </w:r>
+          </w:p>
+        </w:tc>
+        <w:tc>
+          <w:tcPr>
+            <w:tcW w:w="2400" w:type="dxa"/>
+          </w:tcPr>
+          <w:p>
+            <w:pPr/>
+            <w:r>
+              <w:t xml:space="preserve">暂停前段短刹车时间</w:t>
+            </w:r>
+          </w:p>
+        </w:tc>
+      </w:tr>
+      <w:tr>
+        <w:tc>
+          <w:tcPr>
+            <w:tcW w:w="2400" w:type="dxa"/>
+          </w:tcPr>
+          <w:p>
+            <w:pPr/>
+            <w:r>
+              <w:t xml:space="preserve">vdd_nominal_mv</w:t>
+            </w:r>
+          </w:p>
+        </w:tc>
+        <w:tc>
+          <w:tcPr>
+            <w:tcW w:w="2400" w:type="dxa"/>
+          </w:tcPr>
+          <w:p>
+            <w:pPr/>
+            <w:r>
+              <w:t xml:space="preserve">uint16_t</w:t>
+            </w:r>
+          </w:p>
+        </w:tc>
+        <w:tc>
+          <w:tcPr>
+            <w:tcW w:w="2400" w:type="dxa"/>
+          </w:tcPr>
+          <w:p>
+            <w:pPr/>
+            <w:r>
+              <w:t xml:space="preserve">电源监测</w:t>
+            </w:r>
+          </w:p>
+        </w:tc>
+        <w:tc>
+          <w:tcPr>
+            <w:tcW w:w="2400" w:type="dxa"/>
+          </w:tcPr>
+          <w:p>
+            <w:pPr/>
+            <w:r>
+              <w:t xml:space="preserve">标称 MCU/ADC 供电电压</w:t>
+            </w:r>
+          </w:p>
+        </w:tc>
+      </w:tr>
+      <w:tr>
+        <w:tc>
+          <w:tcPr>
+            <w:tcW w:w="2400" w:type="dxa"/>
+          </w:tcPr>
+          <w:p>
+            <w:pPr/>
+            <w:r>
+              <w:t xml:space="preserve">vdd_warn_drop_mv</w:t>
+            </w:r>
+          </w:p>
+        </w:tc>
+        <w:tc>
+          <w:tcPr>
+            <w:tcW w:w="2400" w:type="dxa"/>
+          </w:tcPr>
+          <w:p>
+            <w:pPr/>
+            <w:r>
+              <w:t xml:space="preserve">uint16_t</w:t>
+            </w:r>
+          </w:p>
+        </w:tc>
+        <w:tc>
+          <w:tcPr>
+            <w:tcW w:w="2400" w:type="dxa"/>
+          </w:tcPr>
+          <w:p>
+            <w:pPr/>
+            <w:r>
+              <w:t xml:space="preserve">电源监测</w:t>
+            </w:r>
+          </w:p>
+        </w:tc>
+        <w:tc>
+          <w:tcPr>
+            <w:tcW w:w="2400" w:type="dxa"/>
+          </w:tcPr>
+          <w:p>
+            <w:pPr/>
+            <w:r>
+              <w:t xml:space="preserve">低于标称多少 mV 视为明显跌落</w:t>
+            </w:r>
+          </w:p>
+        </w:tc>
+      </w:tr>
+      <w:tr>
+        <w:tc>
+          <w:tcPr>
+            <w:tcW w:w="2400" w:type="dxa"/>
+          </w:tcPr>
+          <w:p>
+            <w:pPr/>
+            <w:r>
+              <w:t xml:space="preserve">vdd_noise_band_mv</w:t>
+            </w:r>
+          </w:p>
+        </w:tc>
+        <w:tc>
+          <w:tcPr>
+            <w:tcW w:w="2400" w:type="dxa"/>
+          </w:tcPr>
+          <w:p>
+            <w:pPr/>
+            <w:r>
+              <w:t xml:space="preserve">uint16_t</w:t>
+            </w:r>
+          </w:p>
+        </w:tc>
+        <w:tc>
+          <w:tcPr>
+            <w:tcW w:w="2400" w:type="dxa"/>
+          </w:tcPr>
+          <w:p>
+            <w:pPr/>
+            <w:r>
+              <w:t xml:space="preserve">电源监测</w:t>
+            </w:r>
+          </w:p>
+        </w:tc>
+        <w:tc>
+          <w:tcPr>
+            <w:tcW w:w="2400" w:type="dxa"/>
+          </w:tcPr>
+          <w:p>
+            <w:pPr/>
+            <w:r>
+              <w:t xml:space="preserve">VDD 抖动评估阈值</w:t>
+            </w:r>
+          </w:p>
+        </w:tc>
+      </w:tr>
+      <w:tr>
+        <w:tc>
+          <w:tcPr>
+            <w:tcW w:w="2400" w:type="dxa"/>
+          </w:tcPr>
+          <w:p>
+            <w:pPr/>
+            <w:r>
+              <w:t xml:space="preserve">vdd_sample_interval_ms</w:t>
+            </w:r>
+          </w:p>
+        </w:tc>
+        <w:tc>
+          <w:tcPr>
+            <w:tcW w:w="2400" w:type="dxa"/>
+          </w:tcPr>
+          <w:p>
+            <w:pPr/>
+            <w:r>
+              <w:t xml:space="preserve">uint16_t</w:t>
+            </w:r>
+          </w:p>
+        </w:tc>
+        <w:tc>
+          <w:tcPr>
+            <w:tcW w:w="2400" w:type="dxa"/>
+          </w:tcPr>
+          <w:p>
+            <w:pPr/>
+            <w:r>
+              <w:t xml:space="preserve">电源监测</w:t>
+            </w:r>
+          </w:p>
+        </w:tc>
+        <w:tc>
+          <w:tcPr>
+            <w:tcW w:w="2400" w:type="dxa"/>
+          </w:tcPr>
+          <w:p>
+            <w:pPr/>
+            <w:r>
+              <w:t xml:space="preserve">读取内部 VREFINT 估算 VDD 的间隔</w:t>
             </w:r>
           </w:p>
         </w:tc>
@@ -5546,6 +6834,98 @@
           <w:p>
             <w:pPr/>
             <w:r>
+              <w:t xml:space="preserve">vrefint_raw</w:t>
+            </w:r>
+          </w:p>
+        </w:tc>
+        <w:tc>
+          <w:tcPr>
+            <w:tcW w:w="2400" w:type="dxa"/>
+          </w:tcPr>
+          <w:p>
+            <w:pPr/>
+            <w:r>
+              <w:t xml:space="preserve">uint16_t</w:t>
+            </w:r>
+          </w:p>
+        </w:tc>
+        <w:tc>
+          <w:tcPr>
+            <w:tcW w:w="2400" w:type="dxa"/>
+          </w:tcPr>
+          <w:p>
+            <w:pPr/>
+            <w:r>
+              <w:t xml:space="preserve">ADC 内部通道</w:t>
+            </w:r>
+          </w:p>
+        </w:tc>
+        <w:tc>
+          <w:tcPr>
+            <w:tcW w:w="2400" w:type="dxa"/>
+          </w:tcPr>
+          <w:p>
+            <w:pPr/>
+            <w:r>
+              <w:t xml:space="preserve">内部 VREFINT 原始 ADC，用于判断 VDD 变化</w:t>
+            </w:r>
+          </w:p>
+        </w:tc>
+      </w:tr>
+      <w:tr>
+        <w:tc>
+          <w:tcPr>
+            <w:tcW w:w="2400" w:type="dxa"/>
+          </w:tcPr>
+          <w:p>
+            <w:pPr/>
+            <w:r>
+              <w:t xml:space="preserve">vdd_mv</w:t>
+            </w:r>
+          </w:p>
+        </w:tc>
+        <w:tc>
+          <w:tcPr>
+            <w:tcW w:w="2400" w:type="dxa"/>
+          </w:tcPr>
+          <w:p>
+            <w:pPr/>
+            <w:r>
+              <w:t xml:space="preserve">uint16_t</w:t>
+            </w:r>
+          </w:p>
+        </w:tc>
+        <w:tc>
+          <w:tcPr>
+            <w:tcW w:w="2400" w:type="dxa"/>
+          </w:tcPr>
+          <w:p>
+            <w:pPr/>
+            <w:r>
+              <w:t xml:space="preserve">ADC 内部通道</w:t>
+            </w:r>
+          </w:p>
+        </w:tc>
+        <w:tc>
+          <w:tcPr>
+            <w:tcW w:w="2400" w:type="dxa"/>
+          </w:tcPr>
+          <w:p>
+            <w:pPr/>
+            <w:r>
+              <w:t xml:space="preserve">由 VREFINT 估算的 MCU/ADC 供电电压</w:t>
+            </w:r>
+          </w:p>
+        </w:tc>
+      </w:tr>
+      <w:tr>
+        <w:tc>
+          <w:tcPr>
+            <w:tcW w:w="2400" w:type="dxa"/>
+          </w:tcPr>
+          <w:p>
+            <w:pPr/>
+            <w:r>
               <w:t xml:space="preserve">reserved</w:t>
             </w:r>
           </w:p>
@@ -5672,6 +7052,30 @@
             <w:pPr/>
             <w:r>
               <w:t xml:space="preserve">target_adc、feedback_adc_raw、feedback_adc、error_adc</w:t>
+            </w:r>
+          </w:p>
+        </w:tc>
+      </w:tr>
+      <w:tr>
+        <w:tc>
+          <w:tcPr>
+            <w:tcW w:w="2400" w:type="dxa"/>
+          </w:tcPr>
+          <w:p>
+            <w:pPr/>
+            <w:r>
+              <w:t xml:space="preserve">电源页</w:t>
+            </w:r>
+          </w:p>
+        </w:tc>
+        <w:tc>
+          <w:tcPr>
+            <w:tcW w:w="2400" w:type="dxa"/>
+          </w:tcPr>
+          <w:p>
+            <w:pPr/>
+            <w:r>
+              <w:t xml:space="preserve">vrefint_raw、vdd_mv、VDD 跌落/抖动提示</w:t>
             </w:r>
           </w:p>
         </w:tc>

</xml_diff>

<commit_message>
Document development LCDM interface
</commit_message>
<xml_diff>
--- a/docs/servo_config_protocol.docx
+++ b/docs/servo_config_protocol.docx
@@ -19,7 +19,7 @@
     <w:p>
       <w:pPr/>
       <w:r>
-        <w:t xml:space="preserve">目标：PA4 同一根舵机信号线既接收普通 PWM 控制，也作为配置器写入/读取参数和读取硬件状态的半双工通讯线。只有完成双向握手后，舵机才进入配置模式并允许写入参数。</w:t>
+        <w:t xml:space="preserve">目标：同一套 ServoParams、ServoTelemetry 和 ServoComm 帧格式同时服务三种场景：PA4 单线配置器、开发板 LCDM 调试界面、生产写参数工装。最终 SOP8 目标板不需要直接驱动 LCDM；LCDM 属于开发板/工装前端。</w:t>
       </w:r>
     </w:p>
     <w:p>
@@ -329,7 +329,351 @@
         <w:pStyle w:val="Heading1"/>
       </w:pPr>
       <w:r>
+        <w:t xml:space="preserve">1A. 开发板 LCDM 模式</w:t>
+      </w:r>
+    </w:p>
+    <w:p>
+      <w:pPr/>
+      <w:r>
+        <w:t xml:space="preserve">开发板和最终目标板不共用 PCB，因此 LCDM 不受 SOP8 IO 限制。开发板可用 USART1 连接串口 HMI 智能屏，目标板仍只保留舵机控制和参数页。</w:t>
+      </w:r>
+    </w:p>
+    <w:tbl>
+      <w:tblPr>
+        <w:tblStyle w:val="TableGrid"/>
+        <w:tblW w:w="0" w:type="auto"/>
+        <w:tblBorders>
+          <w:top w:val="single" w:sz="4" w:space="0" w:color="auto"/>
+          <w:left w:val="single" w:sz="4" w:space="0" w:color="auto"/>
+          <w:bottom w:val="single" w:sz="4" w:space="0" w:color="auto"/>
+          <w:right w:val="single" w:sz="4" w:space="0" w:color="auto"/>
+          <w:insideH w:val="single" w:sz="4" w:space="0" w:color="auto"/>
+          <w:insideV w:val="single" w:sz="4" w:space="0" w:color="auto"/>
+        </w:tblBorders>
+      </w:tblPr>
+      <w:tr>
+        <w:tc>
+          <w:tcPr>
+            <w:tcW w:w="2400" w:type="dxa"/>
+          </w:tcPr>
+          <w:p>
+            <w:pPr/>
+            <w:r>
+              <w:t xml:space="preserve">项目</w:t>
+            </w:r>
+          </w:p>
+        </w:tc>
+        <w:tc>
+          <w:tcPr>
+            <w:tcW w:w="2400" w:type="dxa"/>
+          </w:tcPr>
+          <w:p>
+            <w:pPr/>
+            <w:r>
+              <w:t xml:space="preserve">定义</w:t>
+            </w:r>
+          </w:p>
+        </w:tc>
+      </w:tr>
+      <w:tr>
+        <w:tc>
+          <w:tcPr>
+            <w:tcW w:w="2400" w:type="dxa"/>
+          </w:tcPr>
+          <w:p>
+            <w:pPr/>
+            <w:r>
+              <w:t xml:space="preserve">LCDM 物理接口</w:t>
+            </w:r>
+          </w:p>
+        </w:tc>
+        <w:tc>
+          <w:tcPr>
+            <w:tcW w:w="2400" w:type="dxa"/>
+          </w:tcPr>
+          <w:p>
+            <w:pPr/>
+            <w:r>
+              <w:t xml:space="preserve">USART1，建议 115200 bps 或 57600 bps，8N1</w:t>
+            </w:r>
+          </w:p>
+        </w:tc>
+      </w:tr>
+      <w:tr>
+        <w:tc>
+          <w:tcPr>
+            <w:tcW w:w="2400" w:type="dxa"/>
+          </w:tcPr>
+          <w:p>
+            <w:pPr/>
+            <w:r>
+              <w:t xml:space="preserve">LCDM 类型</w:t>
+            </w:r>
+          </w:p>
+        </w:tc>
+        <w:tc>
+          <w:tcPr>
+            <w:tcW w:w="2400" w:type="dxa"/>
+          </w:tcPr>
+          <w:p>
+            <w:pPr/>
+            <w:r>
+              <w:t xml:space="preserve">UART HMI 智能屏，屏幕端负责页面、条形图、触摸按钮</w:t>
+            </w:r>
+          </w:p>
+        </w:tc>
+      </w:tr>
+      <w:tr>
+        <w:tc>
+          <w:tcPr>
+            <w:tcW w:w="2400" w:type="dxa"/>
+          </w:tcPr>
+          <w:p>
+            <w:pPr/>
+            <w:r>
+              <w:t xml:space="preserve">PY32 任务</w:t>
+            </w:r>
+          </w:p>
+        </w:tc>
+        <w:tc>
+          <w:tcPr>
+            <w:tcW w:w="2400" w:type="dxa"/>
+          </w:tcPr>
+          <w:p>
+            <w:pPr/>
+            <w:r>
+              <w:t xml:space="preserve">发送遥测变量，接收参数修改命令，不直接绘制像素</w:t>
+            </w:r>
+          </w:p>
+        </w:tc>
+      </w:tr>
+      <w:tr>
+        <w:tc>
+          <w:tcPr>
+            <w:tcW w:w="2400" w:type="dxa"/>
+          </w:tcPr>
+          <w:p>
+            <w:pPr/>
+            <w:r>
+              <w:t xml:space="preserve">协议</w:t>
+            </w:r>
+          </w:p>
+        </w:tc>
+        <w:tc>
+          <w:tcPr>
+            <w:tcW w:w="2400" w:type="dxa"/>
+          </w:tcPr>
+          <w:p>
+            <w:pPr/>
+            <w:r>
+              <w:t xml:space="preserve">复用本文第 4 节帧格式和第 5 节命令表</w:t>
+            </w:r>
+          </w:p>
+        </w:tc>
+      </w:tr>
+      <w:tr>
+        <w:tc>
+          <w:tcPr>
+            <w:tcW w:w="2400" w:type="dxa"/>
+          </w:tcPr>
+          <w:p>
+            <w:pPr/>
+            <w:r>
+              <w:t xml:space="preserve">最终目标板</w:t>
+            </w:r>
+          </w:p>
+        </w:tc>
+        <w:tc>
+          <w:tcPr>
+            <w:tcW w:w="2400" w:type="dxa"/>
+          </w:tcPr>
+          <w:p>
+            <w:pPr/>
+            <w:r>
+              <w:t xml:space="preserve">不接 LCDM；生产时写入已调好的 ServoParams</w:t>
+            </w:r>
+          </w:p>
+        </w:tc>
+      </w:tr>
+    </w:tbl>
+    <w:p>
+      <w:pPr/>
+      <w:r>
+        <w:t xml:space="preserve">开发板 LCDM 和 PA4 单线配置可以共用上层包处理函数 Servo_Comm_HandleFrame()，只是在底层收发不同：</w:t>
+      </w:r>
+    </w:p>
+    <w:tbl>
+      <w:tblPr>
+        <w:tblStyle w:val="TableGrid"/>
+        <w:tblW w:w="0" w:type="auto"/>
+        <w:tblBorders>
+          <w:top w:val="single" w:sz="4" w:space="0" w:color="auto"/>
+          <w:left w:val="single" w:sz="4" w:space="0" w:color="auto"/>
+          <w:bottom w:val="single" w:sz="4" w:space="0" w:color="auto"/>
+          <w:right w:val="single" w:sz="4" w:space="0" w:color="auto"/>
+          <w:insideH w:val="single" w:sz="4" w:space="0" w:color="auto"/>
+          <w:insideV w:val="single" w:sz="4" w:space="0" w:color="auto"/>
+        </w:tblBorders>
+      </w:tblPr>
+      <w:tr>
+        <w:tc>
+          <w:tcPr>
+            <w:tcW w:w="2400" w:type="dxa"/>
+          </w:tcPr>
+          <w:p>
+            <w:pPr/>
+            <w:r>
+              <w:t xml:space="preserve">前端</w:t>
+            </w:r>
+          </w:p>
+        </w:tc>
+        <w:tc>
+          <w:tcPr>
+            <w:tcW w:w="2400" w:type="dxa"/>
+          </w:tcPr>
+          <w:p>
+            <w:pPr/>
+            <w:r>
+              <w:t xml:space="preserve">底层收发</w:t>
+            </w:r>
+          </w:p>
+        </w:tc>
+        <w:tc>
+          <w:tcPr>
+            <w:tcW w:w="2400" w:type="dxa"/>
+          </w:tcPr>
+          <w:p>
+            <w:pPr/>
+            <w:r>
+              <w:t xml:space="preserve">上层处理</w:t>
+            </w:r>
+          </w:p>
+        </w:tc>
+      </w:tr>
+      <w:tr>
+        <w:tc>
+          <w:tcPr>
+            <w:tcW w:w="2400" w:type="dxa"/>
+          </w:tcPr>
+          <w:p>
+            <w:pPr/>
+            <w:r>
+              <w:t xml:space="preserve">PA4 单线配置器</w:t>
+            </w:r>
+          </w:p>
+        </w:tc>
+        <w:tc>
+          <w:tcPr>
+            <w:tcW w:w="2400" w:type="dxa"/>
+          </w:tcPr>
+          <w:p>
+            <w:pPr/>
+            <w:r>
+              <w:t xml:space="preserve">单线半双工，Break + Sync 后进入配置</w:t>
+            </w:r>
+          </w:p>
+        </w:tc>
+        <w:tc>
+          <w:tcPr>
+            <w:tcW w:w="2400" w:type="dxa"/>
+          </w:tcPr>
+          <w:p>
+            <w:pPr/>
+            <w:r>
+              <w:t xml:space="preserve">ServoComm</w:t>
+            </w:r>
+          </w:p>
+        </w:tc>
+      </w:tr>
+      <w:tr>
+        <w:tc>
+          <w:tcPr>
+            <w:tcW w:w="2400" w:type="dxa"/>
+          </w:tcPr>
+          <w:p>
+            <w:pPr/>
+            <w:r>
+              <w:t xml:space="preserve">开发板 LCDM</w:t>
+            </w:r>
+          </w:p>
+        </w:tc>
+        <w:tc>
+          <w:tcPr>
+            <w:tcW w:w="2400" w:type="dxa"/>
+          </w:tcPr>
+          <w:p>
+            <w:pPr/>
+            <w:r>
+              <w:t xml:space="preserve">USART1 全双工或半双工串口</w:t>
+            </w:r>
+          </w:p>
+        </w:tc>
+        <w:tc>
+          <w:tcPr>
+            <w:tcW w:w="2400" w:type="dxa"/>
+          </w:tcPr>
+          <w:p>
+            <w:pPr/>
+            <w:r>
+              <w:t xml:space="preserve">ServoComm</w:t>
+            </w:r>
+          </w:p>
+        </w:tc>
+      </w:tr>
+      <w:tr>
+        <w:tc>
+          <w:tcPr>
+            <w:tcW w:w="2400" w:type="dxa"/>
+          </w:tcPr>
+          <w:p>
+            <w:pPr/>
+            <w:r>
+              <w:t xml:space="preserve">PC 生产工装</w:t>
+            </w:r>
+          </w:p>
+        </w:tc>
+        <w:tc>
+          <w:tcPr>
+            <w:tcW w:w="2400" w:type="dxa"/>
+          </w:tcPr>
+          <w:p>
+            <w:pPr/>
+            <w:r>
+              <w:t xml:space="preserve">USB-UART 或 SWD 辅助下载</w:t>
+            </w:r>
+          </w:p>
+        </w:tc>
+        <w:tc>
+          <w:tcPr>
+            <w:tcW w:w="2400" w:type="dxa"/>
+          </w:tcPr>
+          <w:p>
+            <w:pPr/>
+            <w:r>
+              <w:t xml:space="preserve">ServoComm 或直接写参数页</w:t>
+            </w:r>
+          </w:p>
+        </w:tc>
+      </w:tr>
+    </w:tbl>
+    <w:p>
+      <w:pPr/>
+      <w:r>
+        <w:t xml:space="preserve">LCDM 页面规划和选型见 docs/lcdm_development_interface.md。</w:t>
+      </w:r>
+    </w:p>
+    <w:p>
+      <w:pPr>
+        <w:pStyle w:val="Heading1"/>
+      </w:pPr>
+      <w:r>
         <w:t xml:space="preserve">2. 物理层</w:t>
+      </w:r>
+    </w:p>
+    <w:p>
+      <w:pPr/>
+      <w:r>
+        <w:t xml:space="preserve">本节主要描述最终舵机 3PIN 信号线上的 PA4 单线配置方式。开发板 LCDM 模式可以直接使用 USART1，不必占用 PA4，也不受 SOP8 目标板 IO 限制。</w:t>
       </w:r>
     </w:p>
     <w:tbl>

</xml_diff>